<commit_message>
Fix hardcoded values and cover letter quote nesting
- Replace hardcoded 80.4% with dynamic R²*100 (actual: 81.4%) in EN/JA
- Replace hardcoded 62% attenuation with dynamic computation (actual: 84%) in EN/JA
- Fix double opening curly quotes in cover letter title quotation
- Move attenuation variable computation before first use in EN script
- Regenerate output docx files with corrected values

Co-Authored-By: Tatsuki Onishi <bougtoir@gmail.com>
</commit_message>
<xml_diff>
--- a/ndb-pain-regional-variation-japan/output/ejp/EJP_manuscript_EN.docx
+++ b/ndb-pain-regional-variation-japan/output/ejp/EJP_manuscript_EN.docx
@@ -1354,7 +1354,7 @@
     </w:p>
     <w:p>
       <w:r>
-        <w:t>Neuropathic pain prescribing showed strong correlations with confounder proxies. Diabetes drug prescribing was the strongest (r = 0.87, P &lt; 0.001), followed by anxiolytics (r = 0.75), antidepressants (r = 0.46), and herpes antivirals (r = 0.19). These collectively explained 80.4% of variance (R² = 0.814 in Model 2; Fig. 2).</w:t>
+        <w:t>Neuropathic pain prescribing showed strong correlations with confounder proxies. Diabetes drug prescribing was the strongest (r = 0.87, P &lt; 0.001), followed by anxiolytics (r = 0.75), antidepressants (r = 0.46), and herpes antivirals (r = 0.19). These collectively explained 81.4% of variance (R² = 0.814 in Model 2; Fig. 2).</w:t>
       </w:r>
     </w:p>
     <w:p>
@@ -2096,7 +2096,7 @@
     </w:p>
     <w:p>
       <w:r>
-        <w:t>Acute perioperative prescribing correlated positively with unadjusted neuropathic pain prescribing (r = 0.38, P = 0.008; Fig. 5a). After confounder adjustment, this was attenuated (r = 0.29, P = 0.052; Fig. 5b). In Model 5, acute pain index remained a significant predictor (β = 1.90, P = 0.044), while the Tohoku effect remained nonsignificant (β = 31.5, P = 0.149). A comprehensive Z-score heatmap confirmed the heterogeneous multi-variable pattern (Supplementary Fig. 1). After adjustment, the Tohoku effect was attenuated by 62% and became nonsignificant (Table 3).</w:t>
+        <w:t>Acute perioperative prescribing correlated positively with unadjusted neuropathic pain prescribing (r = 0.38, P = 0.008; Fig. 5a). After confounder adjustment, this was attenuated (r = 0.29, P = 0.052; Fig. 5b). In Model 5, acute pain index remained a significant predictor (β = 1.90, P = 0.044), while the Tohoku effect remained nonsignificant (β = 31.5, P = 0.149). A comprehensive Z-score heatmap confirmed the heterogeneous multi-variable pattern (Supplementary Fig. 1). After adjustment, the Tohoku effect was attenuated by 84% and became nonsignificant (Table 3).</w:t>
       </w:r>
     </w:p>
     <w:p>
@@ -2476,7 +2476,7 @@
           <w:i/>
           <w:sz w:val="16"/>
         </w:rPr>
-        <w:t>Confounders: oral hypoglycemic agents (diabetes proxy), herpes zoster antivirals, antidepressants (excluding duloxetine), and anxiolytics. Adjustment reduced the Tohoku effect by 62% and rendered it nonsignificant.</w:t>
+        <w:t>Confounders: oral hypoglycemic agents (diabetes proxy), herpes zoster antivirals, antidepressants (excluding duloxetine), and anxiolytics. Adjustment reduced the Tohoku effect by 84% and rendered it nonsignificant.</w:t>
       </w:r>
     </w:p>
     <w:p/>
@@ -2577,7 +2577,7 @@
     </w:p>
     <w:p>
       <w:r>
-        <w:t>The most methodologically important finding is that the dramatic regional variation in neuropathic pain prescribing (unadjusted d = 2.81 for Tohoku vs rest) was largely explained by confounding disease proxies. Diabetes drug prescribing alone correlated at r = 0.87 with neuropathic pain prescribing, reflecting the known high prevalence of diabetic neuropathy requiring gabapentinoids. After adjustment, the Tohoku effect was attenuated by 62% and became nonsignificant (Table 3). This has important implications for ecological pain research: studies using neuropathic pain drug prescribing as a population-level CPSP proxy must account for confounding diseases. Without such adjustment, regional differences in diabetes prevalence could be misinterpreted as differences in CPSP. The within-database confounder adjustment demonstrated here—using disease-specific drug proxies from the same data source—provides a replicable framework.</w:t>
+        <w:t>The most methodologically important finding is that the dramatic regional variation in neuropathic pain prescribing (unadjusted d = 2.81 for Tohoku vs rest) was largely explained by confounding disease proxies. Diabetes drug prescribing alone correlated at r = 0.87 with neuropathic pain prescribing, reflecting the known high prevalence of diabetic neuropathy requiring gabapentinoids. After adjustment, the Tohoku effect was attenuated by 84% and became nonsignificant (Table 3). This has important implications for ecological pain research: studies using neuropathic pain drug prescribing as a population-level CPSP proxy must account for confounding diseases. Without such adjustment, regional differences in diabetes prevalence could be misinterpreted as differences in CPSP. The within-database confounder adjustment demonstrated here—using disease-specific drug proxies from the same data source—provides a replicable framework.</w:t>
       </w:r>
     </w:p>
     <w:p>

</xml_diff>